<commit_message>
Update CV and Index
</commit_message>
<xml_diff>
--- a/C.V. Carl Michael Galang.docx
+++ b/C.V. Carl Michael Galang.docx
@@ -69,7 +69,39 @@
           <w:sz w:val="24"/>
           <w:szCs w:val="24"/>
         </w:rPr>
-        <w:t>03/25/2026</w:t>
+        <w:t>0</w:t>
+      </w:r>
+      <w:r>
+        <w:rPr>
+          <w:rFonts w:ascii="Times New Roman" w:hAnsi="Times New Roman" w:cs="Times New Roman"/>
+          <w:sz w:val="24"/>
+          <w:szCs w:val="24"/>
+        </w:rPr>
+        <w:t>5</w:t>
+      </w:r>
+      <w:r>
+        <w:rPr>
+          <w:rFonts w:ascii="Times New Roman" w:hAnsi="Times New Roman" w:cs="Times New Roman"/>
+          <w:sz w:val="24"/>
+          <w:szCs w:val="24"/>
+        </w:rPr>
+        <w:t>/</w:t>
+      </w:r>
+      <w:r>
+        <w:rPr>
+          <w:rFonts w:ascii="Times New Roman" w:hAnsi="Times New Roman" w:cs="Times New Roman"/>
+          <w:sz w:val="24"/>
+          <w:szCs w:val="24"/>
+        </w:rPr>
+        <w:t>18</w:t>
+      </w:r>
+      <w:r>
+        <w:rPr>
+          <w:rFonts w:ascii="Times New Roman" w:hAnsi="Times New Roman" w:cs="Times New Roman"/>
+          <w:sz w:val="24"/>
+          <w:szCs w:val="24"/>
+        </w:rPr>
+        <w:t>/2026</w:t>
       </w:r>
     </w:p>
     <w:p>
@@ -312,7 +344,20 @@
           <w:rFonts w:ascii="Times New Roman" w:hAnsi="Times New Roman" w:cs="Times New Roman"/>
         </w:rPr>
         <w:tab/>
-        <w:t xml:space="preserve">    2020</w:t>
+        <w:t xml:space="preserve">    </w:t>
+      </w:r>
+      <w:r>
+        <w:rPr>
+          <w:rFonts w:ascii="Times New Roman" w:hAnsi="Times New Roman" w:cs="Times New Roman"/>
+        </w:rPr>
+        <w:tab/>
+        <w:t xml:space="preserve">     </w:t>
+      </w:r>
+      <w:r>
+        <w:rPr>
+          <w:rFonts w:ascii="Times New Roman" w:hAnsi="Times New Roman" w:cs="Times New Roman"/>
+        </w:rPr>
+        <w:t>2020</w:t>
       </w:r>
     </w:p>
     <w:p>
@@ -447,7 +492,20 @@
           <w:rFonts w:ascii="Times New Roman" w:hAnsi="Times New Roman" w:cs="Times New Roman"/>
         </w:rPr>
         <w:tab/>
-        <w:t xml:space="preserve">    2014</w:t>
+        <w:t xml:space="preserve">    </w:t>
+      </w:r>
+      <w:r>
+        <w:rPr>
+          <w:rFonts w:ascii="Times New Roman" w:hAnsi="Times New Roman" w:cs="Times New Roman"/>
+        </w:rPr>
+        <w:tab/>
+        <w:t xml:space="preserve">     </w:t>
+      </w:r>
+      <w:r>
+        <w:rPr>
+          <w:rFonts w:ascii="Times New Roman" w:hAnsi="Times New Roman" w:cs="Times New Roman"/>
+        </w:rPr>
+        <w:t>2014</w:t>
       </w:r>
     </w:p>
     <w:p>
@@ -563,7 +621,19 @@
           <w:rFonts w:ascii="Times New Roman" w:hAnsi="Times New Roman" w:cs="Times New Roman"/>
         </w:rPr>
         <w:tab/>
-        <w:t xml:space="preserve">              Sept. 2025</w:t>
+        <w:t xml:space="preserve">              </w:t>
+      </w:r>
+      <w:r>
+        <w:rPr>
+          <w:rFonts w:ascii="Times New Roman" w:hAnsi="Times New Roman" w:cs="Times New Roman"/>
+        </w:rPr>
+        <w:t xml:space="preserve">                  </w:t>
+      </w:r>
+      <w:r>
+        <w:rPr>
+          <w:rFonts w:ascii="Times New Roman" w:hAnsi="Times New Roman" w:cs="Times New Roman"/>
+        </w:rPr>
+        <w:t>Sept. 2025</w:t>
       </w:r>
       <w:r>
         <w:rPr>
@@ -718,7 +788,26 @@
         <w:rPr>
           <w:rFonts w:ascii="Times New Roman" w:hAnsi="Times New Roman" w:cs="Times New Roman"/>
         </w:rPr>
-        <w:t xml:space="preserve">Oct. 2021 – </w:t>
+        <w:t xml:space="preserve"> </w:t>
+      </w:r>
+      <w:r>
+        <w:rPr>
+          <w:rFonts w:ascii="Times New Roman" w:hAnsi="Times New Roman" w:cs="Times New Roman"/>
+        </w:rPr>
+        <w:tab/>
+      </w:r>
+      <w:r>
+        <w:rPr>
+          <w:rFonts w:ascii="Times New Roman" w:hAnsi="Times New Roman" w:cs="Times New Roman"/>
+        </w:rPr>
+        <w:tab/>
+        <w:t xml:space="preserve">  Oct.</w:t>
+      </w:r>
+      <w:r>
+        <w:rPr>
+          <w:rFonts w:ascii="Times New Roman" w:hAnsi="Times New Roman" w:cs="Times New Roman"/>
+        </w:rPr>
+        <w:t xml:space="preserve"> 2021 – </w:t>
       </w:r>
       <w:r>
         <w:rPr>
@@ -887,45 +976,85 @@
         <w:outlineLvl w:val="0"/>
         <w:rPr>
           <w:rFonts w:ascii="Times New Roman" w:hAnsi="Times New Roman" w:cs="Times New Roman"/>
-          <w:lang w:val="en-CA"/>
-        </w:rPr>
-      </w:pPr>
-      <w:r>
-        <w:rPr>
-          <w:rFonts w:ascii="Times New Roman" w:hAnsi="Times New Roman" w:cs="Times New Roman"/>
-          <w:lang w:val="en-CA"/>
-        </w:rPr>
-        <w:t xml:space="preserve">Aczel, B., Szaszi, B., Clelland, H. T., Kovacs, M., Schulz-Kümpel, H., Holzmeister, F., …, </w:t>
-      </w:r>
-      <w:r>
-        <w:rPr>
-          <w:rFonts w:ascii="Times New Roman" w:hAnsi="Times New Roman" w:cs="Times New Roman"/>
-          <w:b/>
-          <w:bCs/>
-          <w:lang w:val="en-CA"/>
-        </w:rPr>
-        <w:t>Galang, C.M.</w:t>
-      </w:r>
-      <w:r>
-        <w:rPr>
-          <w:rFonts w:ascii="Times New Roman" w:hAnsi="Times New Roman" w:cs="Times New Roman"/>
-          <w:lang w:val="en-CA"/>
-        </w:rPr>
-        <w:t xml:space="preserve">, … &amp; Nosek, B. A. (In Press). Investigating the analytical robustness of the social and behavioural sciences. </w:t>
-      </w:r>
-      <w:r>
-        <w:rPr>
-          <w:rFonts w:ascii="Times New Roman" w:hAnsi="Times New Roman" w:cs="Times New Roman"/>
+          <w:bCs/>
+          <w:lang w:val="en-CA"/>
+        </w:rPr>
+      </w:pPr>
+      <w:r>
+        <w:rPr>
+          <w:rFonts w:ascii="Times New Roman" w:hAnsi="Times New Roman" w:cs="Times New Roman"/>
+          <w:bCs/>
+          <w:lang w:val="en-CA"/>
+        </w:rPr>
+        <w:t xml:space="preserve">Marschner, M., </w:t>
+      </w:r>
+      <w:r>
+        <w:rPr>
+          <w:rFonts w:ascii="Times New Roman" w:hAnsi="Times New Roman" w:cs="Times New Roman"/>
+          <w:b/>
+          <w:lang w:val="en-CA"/>
+        </w:rPr>
+        <w:t>Galang, C.M.,</w:t>
+      </w:r>
+      <w:r>
+        <w:rPr>
+          <w:rFonts w:ascii="Times New Roman" w:hAnsi="Times New Roman" w:cs="Times New Roman"/>
+          <w:b/>
+          <w:lang w:val="en-CA"/>
+        </w:rPr>
+        <w:t xml:space="preserve"> </w:t>
+      </w:r>
+      <w:r>
+        <w:rPr>
+          <w:rFonts w:ascii="Times New Roman" w:hAnsi="Times New Roman" w:cs="Times New Roman"/>
+          <w:bCs/>
+          <w:lang w:val="en-CA"/>
+        </w:rPr>
+        <w:t>&amp; Brass, M. (I</w:t>
+      </w:r>
+      <w:r>
+        <w:rPr>
+          <w:rFonts w:ascii="Times New Roman" w:hAnsi="Times New Roman" w:cs="Times New Roman"/>
+          <w:bCs/>
+          <w:lang w:val="en-CA"/>
+        </w:rPr>
+        <w:t>n Press</w:t>
+      </w:r>
+      <w:r>
+        <w:rPr>
+          <w:rFonts w:ascii="Times New Roman" w:hAnsi="Times New Roman" w:cs="Times New Roman"/>
+          <w:bCs/>
+          <w:lang w:val="en-CA"/>
+        </w:rPr>
+        <w:t xml:space="preserve">). </w:t>
+      </w:r>
+      <w:r>
+        <w:rPr>
+          <w:rFonts w:ascii="Times New Roman" w:hAnsi="Times New Roman" w:cs="Times New Roman"/>
+          <w:bCs/>
+        </w:rPr>
+        <w:t>Us and Them: Anticipated Imitation Between Groups.</w:t>
+      </w:r>
+      <w:r>
+        <w:rPr>
+          <w:rFonts w:ascii="Times New Roman" w:hAnsi="Times New Roman" w:cs="Times New Roman"/>
+          <w:bCs/>
+        </w:rPr>
+        <w:t xml:space="preserve"> </w:t>
+      </w:r>
+      <w:r>
+        <w:rPr>
+          <w:rFonts w:ascii="Times New Roman" w:hAnsi="Times New Roman" w:cs="Times New Roman"/>
+          <w:bCs/>
           <w:i/>
           <w:iCs/>
-          <w:lang w:val="en-CA"/>
-        </w:rPr>
-        <w:t>Nature</w:t>
-      </w:r>
-      <w:r>
-        <w:rPr>
-          <w:rFonts w:ascii="Times New Roman" w:hAnsi="Times New Roman" w:cs="Times New Roman"/>
-          <w:lang w:val="en-CA"/>
+        </w:rPr>
+        <w:t>Acta Psychologica</w:t>
+      </w:r>
+      <w:r>
+        <w:rPr>
+          <w:rFonts w:ascii="Times New Roman" w:hAnsi="Times New Roman" w:cs="Times New Roman"/>
+          <w:bCs/>
         </w:rPr>
         <w:t>.</w:t>
       </w:r>
@@ -933,28 +1062,36 @@
     <w:p>
       <w:pPr>
         <w:spacing w:after="0" w:line="240" w:lineRule="auto"/>
-        <w:outlineLvl w:val="0"/>
-        <w:rPr>
-          <w:rFonts w:ascii="Times New Roman" w:hAnsi="Times New Roman" w:cs="Times New Roman"/>
-          <w:b/>
-          <w:lang w:val="en-CA"/>
-        </w:rPr>
-      </w:pPr>
-    </w:p>
-    <w:p>
-      <w:pPr>
-        <w:spacing w:after="0" w:line="240" w:lineRule="auto"/>
-        <w:outlineLvl w:val="0"/>
-        <w:rPr>
-          <w:rFonts w:ascii="Times New Roman" w:hAnsi="Times New Roman" w:cs="Times New Roman"/>
-          <w:bCs/>
-          <w:lang w:val="en-CA"/>
-        </w:rPr>
-      </w:pPr>
-      <w:r>
-        <w:rPr>
-          <w:rFonts w:ascii="Times New Roman" w:hAnsi="Times New Roman" w:cs="Times New Roman"/>
-          <w:b/>
+        <w:jc w:val="both"/>
+        <w:outlineLvl w:val="0"/>
+        <w:rPr>
+          <w:rFonts w:ascii="Times New Roman" w:hAnsi="Times New Roman" w:cs="Times New Roman"/>
+          <w:lang w:val="en-CA"/>
+        </w:rPr>
+      </w:pPr>
+    </w:p>
+    <w:p>
+      <w:pPr>
+        <w:spacing w:after="0" w:line="240" w:lineRule="auto"/>
+        <w:jc w:val="both"/>
+        <w:outlineLvl w:val="0"/>
+        <w:rPr>
+          <w:rFonts w:ascii="Times New Roman" w:hAnsi="Times New Roman" w:cs="Times New Roman"/>
+          <w:lang w:val="en-CA"/>
+        </w:rPr>
+      </w:pPr>
+      <w:r>
+        <w:rPr>
+          <w:rFonts w:ascii="Times New Roman" w:hAnsi="Times New Roman" w:cs="Times New Roman"/>
+          <w:lang w:val="en-CA"/>
+        </w:rPr>
+        <w:t xml:space="preserve">Aczel, B., Szaszi, B., Clelland, H. T., Kovacs, M., Schulz-Kümpel, H., Holzmeister, F., …, </w:t>
+      </w:r>
+      <w:r>
+        <w:rPr>
+          <w:rFonts w:ascii="Times New Roman" w:hAnsi="Times New Roman" w:cs="Times New Roman"/>
+          <w:b/>
+          <w:bCs/>
           <w:lang w:val="en-CA"/>
         </w:rPr>
         <w:t>Galang, C.M.</w:t>
@@ -962,184 +1099,275 @@
       <w:r>
         <w:rPr>
           <w:rFonts w:ascii="Times New Roman" w:hAnsi="Times New Roman" w:cs="Times New Roman"/>
-          <w:bCs/>
-          <w:lang w:val="en-CA"/>
-        </w:rPr>
-        <w:t>, Cracco, E., Chirkov, V., Obhi, S.S., &amp; Brass, M. (</w:t>
-      </w:r>
-      <w:r>
-        <w:rPr>
-          <w:rFonts w:ascii="Times New Roman" w:hAnsi="Times New Roman" w:cs="Times New Roman"/>
-          <w:bCs/>
-          <w:lang w:val="en-CA"/>
-        </w:rPr>
-        <w:t>2025</w:t>
-      </w:r>
-      <w:r>
-        <w:rPr>
-          <w:rFonts w:ascii="Times New Roman" w:hAnsi="Times New Roman" w:cs="Times New Roman"/>
-          <w:bCs/>
-          <w:lang w:val="en-CA"/>
-        </w:rPr>
-        <w:t xml:space="preserve">). Sense of Agency during Group Control. </w:t>
-      </w:r>
-      <w:r>
-        <w:rPr>
-          <w:rFonts w:ascii="Times New Roman" w:hAnsi="Times New Roman" w:cs="Times New Roman"/>
-          <w:bCs/>
+          <w:lang w:val="en-CA"/>
+        </w:rPr>
+        <w:t>, … &amp; Nosek, B. A. (</w:t>
+      </w:r>
+      <w:r>
+        <w:rPr>
+          <w:rFonts w:ascii="Times New Roman" w:hAnsi="Times New Roman" w:cs="Times New Roman"/>
+          <w:lang w:val="en-CA"/>
+        </w:rPr>
+        <w:t>2026</w:t>
+      </w:r>
+      <w:r>
+        <w:rPr>
+          <w:rFonts w:ascii="Times New Roman" w:hAnsi="Times New Roman" w:cs="Times New Roman"/>
+          <w:lang w:val="en-CA"/>
+        </w:rPr>
+        <w:t xml:space="preserve">). Investigating the analytical robustness of the social and behavioural sciences. </w:t>
+      </w:r>
+      <w:r>
+        <w:rPr>
+          <w:rFonts w:ascii="Times New Roman" w:hAnsi="Times New Roman" w:cs="Times New Roman"/>
           <w:i/>
           <w:iCs/>
           <w:lang w:val="en-CA"/>
         </w:rPr>
-        <w:t>Journal of Experimental Psychology: General</w:t>
-      </w:r>
-      <w:r>
-        <w:rPr>
-          <w:rFonts w:ascii="Times New Roman" w:hAnsi="Times New Roman" w:cs="Times New Roman"/>
-          <w:bCs/>
+        <w:t>Nature</w:t>
+      </w:r>
+      <w:r>
+        <w:rPr>
+          <w:rFonts w:ascii="Times New Roman" w:hAnsi="Times New Roman" w:cs="Times New Roman"/>
           <w:i/>
           <w:iCs/>
           <w:lang w:val="en-CA"/>
         </w:rPr>
-        <w:t>, 154</w:t>
-      </w:r>
-      <w:r>
-        <w:rPr>
-          <w:rFonts w:ascii="Times New Roman" w:hAnsi="Times New Roman" w:cs="Times New Roman"/>
-          <w:bCs/>
-          <w:lang w:val="en-CA"/>
-        </w:rPr>
-        <w:t>(12), 3392-3404.</w:t>
-      </w:r>
-    </w:p>
-    <w:p>
-      <w:pPr>
-        <w:spacing w:after="0" w:line="240" w:lineRule="auto"/>
-        <w:jc w:val="both"/>
-        <w:outlineLvl w:val="0"/>
-        <w:rPr>
-          <w:rFonts w:ascii="Times New Roman" w:hAnsi="Times New Roman" w:cs="Times New Roman"/>
-          <w:lang w:val="en-CA"/>
-        </w:rPr>
-      </w:pPr>
-    </w:p>
-    <w:p>
-      <w:pPr>
-        <w:spacing w:after="0" w:line="240" w:lineRule="auto"/>
-        <w:jc w:val="both"/>
-        <w:outlineLvl w:val="0"/>
-        <w:rPr>
-          <w:rFonts w:ascii="Times New Roman" w:hAnsi="Times New Roman" w:cs="Times New Roman"/>
-        </w:rPr>
-      </w:pPr>
-      <w:r>
-        <w:rPr>
-          <w:rFonts w:ascii="Times New Roman" w:hAnsi="Times New Roman" w:cs="Times New Roman"/>
-          <w:b/>
-          <w:bCs/>
-          <w:lang w:val="de-DE"/>
-        </w:rPr>
-        <w:t xml:space="preserve">Galang, C.M., </w:t>
-      </w:r>
-      <w:r>
-        <w:rPr>
-          <w:rFonts w:ascii="Times New Roman" w:hAnsi="Times New Roman" w:cs="Times New Roman"/>
-          <w:lang w:val="de-DE"/>
-        </w:rPr>
-        <w:t xml:space="preserve">Jenkins, M., Sanders, T., Vijh, R., &amp; Obhi, S.S. (2025). </w:t>
-      </w:r>
-      <w:r>
-        <w:rPr>
-          <w:rFonts w:ascii="Times New Roman" w:hAnsi="Times New Roman" w:cs="Times New Roman"/>
-        </w:rPr>
-        <w:t xml:space="preserve">Motor preparation during pain observation does not influence event-related Mu/Beta desynchronization. </w:t>
-      </w:r>
-      <w:r>
-        <w:rPr>
-          <w:rFonts w:ascii="Times New Roman" w:hAnsi="Times New Roman" w:cs="Times New Roman"/>
+        <w:t>, 652</w:t>
+      </w:r>
+      <w:r>
+        <w:rPr>
+          <w:rFonts w:ascii="Times New Roman" w:hAnsi="Times New Roman" w:cs="Times New Roman"/>
+          <w:lang w:val="en-CA"/>
+        </w:rPr>
+        <w:t>, 135-14</w:t>
+      </w:r>
+      <w:r>
+        <w:rPr>
+          <w:rFonts w:ascii="Times New Roman" w:hAnsi="Times New Roman" w:cs="Times New Roman"/>
+          <w:lang w:val="en-CA"/>
+        </w:rPr>
+        <w:t>2</w:t>
+      </w:r>
+      <w:r>
+        <w:rPr>
+          <w:rFonts w:ascii="Times New Roman" w:hAnsi="Times New Roman" w:cs="Times New Roman"/>
+          <w:lang w:val="en-CA"/>
+        </w:rPr>
+        <w:t>.</w:t>
+      </w:r>
+    </w:p>
+    <w:p>
+      <w:pPr>
+        <w:spacing w:after="0" w:line="240" w:lineRule="auto"/>
+        <w:outlineLvl w:val="0"/>
+        <w:rPr>
+          <w:rFonts w:ascii="Times New Roman" w:hAnsi="Times New Roman" w:cs="Times New Roman"/>
+          <w:b/>
+          <w:lang w:val="en-CA"/>
+        </w:rPr>
+      </w:pPr>
+    </w:p>
+    <w:p>
+      <w:pPr>
+        <w:spacing w:after="0" w:line="240" w:lineRule="auto"/>
+        <w:outlineLvl w:val="0"/>
+        <w:rPr>
+          <w:rFonts w:ascii="Times New Roman" w:hAnsi="Times New Roman" w:cs="Times New Roman"/>
+          <w:bCs/>
+          <w:lang w:val="en-CA"/>
+        </w:rPr>
+      </w:pPr>
+      <w:r>
+        <w:rPr>
+          <w:rFonts w:ascii="Times New Roman" w:hAnsi="Times New Roman" w:cs="Times New Roman"/>
+          <w:b/>
+          <w:lang w:val="en-CA"/>
+        </w:rPr>
+        <w:t>Galang, C.M.</w:t>
+      </w:r>
+      <w:r>
+        <w:rPr>
+          <w:rFonts w:ascii="Times New Roman" w:hAnsi="Times New Roman" w:cs="Times New Roman"/>
+          <w:bCs/>
+          <w:lang w:val="en-CA"/>
+        </w:rPr>
+        <w:t>, Cracco, E., Chirkov, V., Obhi, S.S., &amp; Brass, M. (</w:t>
+      </w:r>
+      <w:r>
+        <w:rPr>
+          <w:rFonts w:ascii="Times New Roman" w:hAnsi="Times New Roman" w:cs="Times New Roman"/>
+          <w:bCs/>
+          <w:lang w:val="en-CA"/>
+        </w:rPr>
+        <w:t>2025</w:t>
+      </w:r>
+      <w:r>
+        <w:rPr>
+          <w:rFonts w:ascii="Times New Roman" w:hAnsi="Times New Roman" w:cs="Times New Roman"/>
+          <w:bCs/>
+          <w:lang w:val="en-CA"/>
+        </w:rPr>
+        <w:t xml:space="preserve">). Sense of Agency during Group Control. </w:t>
+      </w:r>
+      <w:r>
+        <w:rPr>
+          <w:rFonts w:ascii="Times New Roman" w:hAnsi="Times New Roman" w:cs="Times New Roman"/>
+          <w:bCs/>
           <w:i/>
           <w:iCs/>
-        </w:rPr>
-        <w:t xml:space="preserve">Cortex, 193, </w:t>
-      </w:r>
-      <w:r>
-        <w:rPr>
-          <w:rFonts w:ascii="Times New Roman" w:hAnsi="Times New Roman" w:cs="Times New Roman"/>
-        </w:rPr>
-        <w:t>160-170.</w:t>
-      </w:r>
-    </w:p>
-    <w:p>
-      <w:pPr>
-        <w:spacing w:after="0" w:line="240" w:lineRule="auto"/>
-        <w:jc w:val="both"/>
-        <w:outlineLvl w:val="0"/>
-        <w:rPr>
-          <w:rFonts w:ascii="Times New Roman" w:hAnsi="Times New Roman" w:cs="Times New Roman"/>
-        </w:rPr>
-      </w:pPr>
-    </w:p>
-    <w:p>
-      <w:pPr>
-        <w:spacing w:after="0" w:line="240" w:lineRule="auto"/>
-        <w:jc w:val="both"/>
-        <w:outlineLvl w:val="0"/>
-        <w:rPr>
-          <w:rFonts w:ascii="Times New Roman" w:hAnsi="Times New Roman" w:cs="Times New Roman"/>
-          <w:lang w:val="en-CA"/>
-        </w:rPr>
-      </w:pPr>
-      <w:r>
-        <w:rPr>
-          <w:rFonts w:ascii="Times New Roman" w:hAnsi="Times New Roman" w:cs="Times New Roman"/>
-          <w:lang w:val="en-CA"/>
-        </w:rPr>
-        <w:t xml:space="preserve">Shum, Y.H., </w:t>
-      </w:r>
-      <w:r>
-        <w:rPr>
-          <w:rFonts w:ascii="Times New Roman" w:hAnsi="Times New Roman" w:cs="Times New Roman"/>
-          <w:b/>
-          <w:bCs/>
-          <w:lang w:val="en-CA"/>
-        </w:rPr>
-        <w:t>Galang, C.M.</w:t>
-      </w:r>
-      <w:r>
-        <w:rPr>
-          <w:rFonts w:ascii="Times New Roman" w:hAnsi="Times New Roman" w:cs="Times New Roman"/>
-          <w:lang w:val="en-CA"/>
-        </w:rPr>
-        <w:t>, &amp; Brass, M. (</w:t>
-      </w:r>
-      <w:r>
-        <w:rPr>
-          <w:rFonts w:ascii="Times New Roman" w:hAnsi="Times New Roman" w:cs="Times New Roman"/>
-          <w:lang w:val="en-CA"/>
-        </w:rPr>
-        <w:t>2025</w:t>
-      </w:r>
-      <w:r>
-        <w:rPr>
-          <w:rFonts w:ascii="Times New Roman" w:hAnsi="Times New Roman" w:cs="Times New Roman"/>
-          <w:lang w:val="en-CA"/>
-        </w:rPr>
-        <w:t xml:space="preserve">). Moderate Manipulation to Somatosensory Feedback Does Not Affect Libet-style Intentional Action. </w:t>
-      </w:r>
-      <w:r>
-        <w:rPr>
-          <w:rFonts w:ascii="Times New Roman" w:hAnsi="Times New Roman" w:cs="Times New Roman"/>
+          <w:lang w:val="en-CA"/>
+        </w:rPr>
+        <w:t>Journal of Experimental Psychology: General</w:t>
+      </w:r>
+      <w:r>
+        <w:rPr>
+          <w:rFonts w:ascii="Times New Roman" w:hAnsi="Times New Roman" w:cs="Times New Roman"/>
+          <w:bCs/>
           <w:i/>
           <w:iCs/>
           <w:lang w:val="en-CA"/>
         </w:rPr>
-        <w:t>Psychological Research</w:t>
+        <w:t>, 154</w:t>
+      </w:r>
+      <w:r>
+        <w:rPr>
+          <w:rFonts w:ascii="Times New Roman" w:hAnsi="Times New Roman" w:cs="Times New Roman"/>
+          <w:bCs/>
+          <w:lang w:val="en-CA"/>
+        </w:rPr>
+        <w:t>(12), 3392-3404.</w:t>
+      </w:r>
+    </w:p>
+    <w:p>
+      <w:pPr>
+        <w:spacing w:after="0" w:line="240" w:lineRule="auto"/>
+        <w:jc w:val="both"/>
+        <w:outlineLvl w:val="0"/>
+        <w:rPr>
+          <w:rFonts w:ascii="Times New Roman" w:hAnsi="Times New Roman" w:cs="Times New Roman"/>
+          <w:lang w:val="en-CA"/>
+        </w:rPr>
+      </w:pPr>
+    </w:p>
+    <w:p>
+      <w:pPr>
+        <w:spacing w:after="0" w:line="240" w:lineRule="auto"/>
+        <w:jc w:val="both"/>
+        <w:outlineLvl w:val="0"/>
+        <w:rPr>
+          <w:rFonts w:ascii="Times New Roman" w:hAnsi="Times New Roman" w:cs="Times New Roman"/>
+        </w:rPr>
+      </w:pPr>
+      <w:r>
+        <w:rPr>
+          <w:rFonts w:ascii="Times New Roman" w:hAnsi="Times New Roman" w:cs="Times New Roman"/>
+          <w:b/>
+          <w:bCs/>
+          <w:lang w:val="de-DE"/>
+        </w:rPr>
+        <w:t xml:space="preserve">Galang, C.M., </w:t>
+      </w:r>
+      <w:r>
+        <w:rPr>
+          <w:rFonts w:ascii="Times New Roman" w:hAnsi="Times New Roman" w:cs="Times New Roman"/>
+          <w:lang w:val="de-DE"/>
+        </w:rPr>
+        <w:t xml:space="preserve">Jenkins, M., Sanders, T., Vijh, R., &amp; Obhi, S.S. (2025). </w:t>
+      </w:r>
+      <w:r>
+        <w:rPr>
+          <w:rFonts w:ascii="Times New Roman" w:hAnsi="Times New Roman" w:cs="Times New Roman"/>
+        </w:rPr>
+        <w:t xml:space="preserve">Motor preparation during pain observation does not influence event-related Mu/Beta desynchronization. </w:t>
       </w:r>
       <w:r>
         <w:rPr>
           <w:rFonts w:ascii="Times New Roman" w:hAnsi="Times New Roman" w:cs="Times New Roman"/>
           <w:i/>
           <w:iCs/>
+        </w:rPr>
+        <w:t xml:space="preserve">Cortex, 193, </w:t>
+      </w:r>
+      <w:r>
+        <w:rPr>
+          <w:rFonts w:ascii="Times New Roman" w:hAnsi="Times New Roman" w:cs="Times New Roman"/>
+        </w:rPr>
+        <w:t>160-170.</w:t>
+      </w:r>
+    </w:p>
+    <w:p>
+      <w:pPr>
+        <w:spacing w:after="0" w:line="240" w:lineRule="auto"/>
+        <w:jc w:val="both"/>
+        <w:outlineLvl w:val="0"/>
+        <w:rPr>
+          <w:rFonts w:ascii="Times New Roman" w:hAnsi="Times New Roman" w:cs="Times New Roman"/>
+        </w:rPr>
+      </w:pPr>
+    </w:p>
+    <w:p>
+      <w:pPr>
+        <w:spacing w:after="0" w:line="240" w:lineRule="auto"/>
+        <w:jc w:val="both"/>
+        <w:outlineLvl w:val="0"/>
+        <w:rPr>
+          <w:rFonts w:ascii="Times New Roman" w:hAnsi="Times New Roman" w:cs="Times New Roman"/>
+          <w:lang w:val="en-CA"/>
+        </w:rPr>
+      </w:pPr>
+      <w:r>
+        <w:rPr>
+          <w:rFonts w:ascii="Times New Roman" w:hAnsi="Times New Roman" w:cs="Times New Roman"/>
+          <w:lang w:val="en-CA"/>
+        </w:rPr>
+        <w:lastRenderedPageBreak/>
+        <w:t xml:space="preserve">Shum, Y.H., </w:t>
+      </w:r>
+      <w:r>
+        <w:rPr>
+          <w:rFonts w:ascii="Times New Roman" w:hAnsi="Times New Roman" w:cs="Times New Roman"/>
+          <w:b/>
+          <w:bCs/>
+          <w:lang w:val="en-CA"/>
+        </w:rPr>
+        <w:t>Galang, C.M.</w:t>
+      </w:r>
+      <w:r>
+        <w:rPr>
+          <w:rFonts w:ascii="Times New Roman" w:hAnsi="Times New Roman" w:cs="Times New Roman"/>
+          <w:lang w:val="en-CA"/>
+        </w:rPr>
+        <w:t>, &amp; Brass, M. (</w:t>
+      </w:r>
+      <w:r>
+        <w:rPr>
+          <w:rFonts w:ascii="Times New Roman" w:hAnsi="Times New Roman" w:cs="Times New Roman"/>
+          <w:lang w:val="en-CA"/>
+        </w:rPr>
+        <w:t>2025</w:t>
+      </w:r>
+      <w:r>
+        <w:rPr>
+          <w:rFonts w:ascii="Times New Roman" w:hAnsi="Times New Roman" w:cs="Times New Roman"/>
+          <w:lang w:val="en-CA"/>
+        </w:rPr>
+        <w:t xml:space="preserve">). Moderate Manipulation to Somatosensory Feedback Does Not Affect Libet-style Intentional Action. </w:t>
+      </w:r>
+      <w:r>
+        <w:rPr>
+          <w:rFonts w:ascii="Times New Roman" w:hAnsi="Times New Roman" w:cs="Times New Roman"/>
+          <w:i/>
+          <w:iCs/>
+          <w:lang w:val="en-CA"/>
+        </w:rPr>
+        <w:t>Psychological Research</w:t>
+      </w:r>
+      <w:r>
+        <w:rPr>
+          <w:rFonts w:ascii="Times New Roman" w:hAnsi="Times New Roman" w:cs="Times New Roman"/>
+          <w:i/>
+          <w:iCs/>
           <w:lang w:val="en-CA"/>
         </w:rPr>
         <w:t>, 89</w:t>
@@ -1179,7 +1407,6 @@
           <w:bCs/>
           <w:lang w:val="en-CA"/>
         </w:rPr>
-        <w:lastRenderedPageBreak/>
         <w:t xml:space="preserve">Edwards, S., </w:t>
       </w:r>
       <w:r>
@@ -2155,6 +2382,7 @@
           <w:b/>
           <w:lang w:val="de-DE"/>
         </w:rPr>
+        <w:lastRenderedPageBreak/>
         <w:t>Galang, C.M.</w:t>
       </w:r>
       <w:r>
@@ -2221,7 +2449,6 @@
           <w:rFonts w:ascii="Times New Roman" w:hAnsi="Times New Roman" w:cs="Times New Roman"/>
           <w:b/>
         </w:rPr>
-        <w:lastRenderedPageBreak/>
         <w:t xml:space="preserve">Galang, C.M. </w:t>
       </w:r>
       <w:r>
@@ -2499,6 +2726,274 @@
         <w:rPr>
           <w:rFonts w:ascii="Times New Roman" w:hAnsi="Times New Roman" w:cs="Times New Roman"/>
           <w:bCs/>
+          <w:lang w:val="en-CA"/>
+        </w:rPr>
+      </w:pPr>
+    </w:p>
+    <w:p>
+      <w:pPr>
+        <w:spacing w:after="0" w:line="240" w:lineRule="auto"/>
+        <w:outlineLvl w:val="0"/>
+        <w:rPr>
+          <w:rFonts w:ascii="Times New Roman" w:hAnsi="Times New Roman" w:cs="Times New Roman"/>
+          <w:b/>
+          <w:lang w:val="en-CA"/>
+        </w:rPr>
+      </w:pPr>
+      <w:r>
+        <w:rPr>
+          <w:rFonts w:ascii="Times New Roman" w:hAnsi="Times New Roman" w:cs="Times New Roman"/>
+          <w:b/>
+          <w:lang w:val="en-CA"/>
+        </w:rPr>
+        <w:t>Under Review</w:t>
+      </w:r>
+    </w:p>
+    <w:p>
+      <w:pPr>
+        <w:spacing w:after="0" w:line="240" w:lineRule="auto"/>
+        <w:outlineLvl w:val="0"/>
+        <w:rPr>
+          <w:rFonts w:ascii="Times New Roman" w:hAnsi="Times New Roman" w:cs="Times New Roman"/>
+          <w:b/>
+          <w:lang w:val="en-CA"/>
+        </w:rPr>
+      </w:pPr>
+    </w:p>
+    <w:p>
+      <w:pPr>
+        <w:spacing w:after="0" w:line="240" w:lineRule="auto"/>
+        <w:outlineLvl w:val="0"/>
+        <w:rPr>
+          <w:rFonts w:ascii="Times New Roman" w:hAnsi="Times New Roman" w:cs="Times New Roman"/>
+          <w:bCs/>
+          <w:lang w:val="en-CA"/>
+        </w:rPr>
+      </w:pPr>
+      <w:r>
+        <w:rPr>
+          <w:rFonts w:ascii="Times New Roman" w:hAnsi="Times New Roman" w:cs="Times New Roman"/>
+          <w:b/>
+          <w:lang w:val="en-CA"/>
+        </w:rPr>
+        <w:t>Galang, C. M.</w:t>
+      </w:r>
+      <w:r>
+        <w:rPr>
+          <w:rFonts w:ascii="Times New Roman" w:hAnsi="Times New Roman" w:cs="Times New Roman"/>
+          <w:bCs/>
+          <w:lang w:val="en-CA"/>
+        </w:rPr>
+        <w:t>,</w:t>
+      </w:r>
+      <w:r>
+        <w:rPr>
+          <w:rFonts w:ascii="Times New Roman" w:hAnsi="Times New Roman" w:cs="Times New Roman"/>
+          <w:bCs/>
+          <w:lang w:val="en-CA"/>
+        </w:rPr>
+        <w:t xml:space="preserve"> Hassanein, K., &amp; Head, M. (</w:t>
+      </w:r>
+      <w:r>
+        <w:rPr>
+          <w:rFonts w:ascii="Times New Roman" w:hAnsi="Times New Roman" w:cs="Times New Roman"/>
+          <w:bCs/>
+          <w:lang w:val="en-CA"/>
+        </w:rPr>
+        <w:t>Under Review</w:t>
+      </w:r>
+      <w:r>
+        <w:rPr>
+          <w:rFonts w:ascii="Times New Roman" w:hAnsi="Times New Roman" w:cs="Times New Roman"/>
+          <w:bCs/>
+          <w:lang w:val="en-CA"/>
+        </w:rPr>
+        <w:t xml:space="preserve">). The intentional stance does not modulate the automatic imitation bias against robots. </w:t>
+      </w:r>
+      <w:r>
+        <w:rPr>
+          <w:rFonts w:ascii="Times New Roman" w:hAnsi="Times New Roman" w:cs="Times New Roman"/>
+          <w:bCs/>
+          <w:i/>
+          <w:iCs/>
+          <w:lang w:val="en-CA"/>
+        </w:rPr>
+        <w:t>Acta Psychologica</w:t>
+      </w:r>
+      <w:r>
+        <w:rPr>
+          <w:rFonts w:ascii="Times New Roman" w:hAnsi="Times New Roman" w:cs="Times New Roman"/>
+          <w:bCs/>
+          <w:lang w:val="en-CA"/>
+        </w:rPr>
+        <w:t>.</w:t>
+      </w:r>
+    </w:p>
+    <w:p>
+      <w:pPr>
+        <w:spacing w:after="0" w:line="240" w:lineRule="auto"/>
+        <w:outlineLvl w:val="0"/>
+        <w:rPr>
+          <w:rFonts w:ascii="Times New Roman" w:hAnsi="Times New Roman" w:cs="Times New Roman"/>
+          <w:bCs/>
+          <w:lang w:val="en-CA"/>
+        </w:rPr>
+      </w:pPr>
+    </w:p>
+    <w:p>
+      <w:pPr>
+        <w:spacing w:after="0" w:line="240" w:lineRule="auto"/>
+        <w:jc w:val="both"/>
+        <w:outlineLvl w:val="0"/>
+        <w:rPr>
+          <w:rFonts w:ascii="Times New Roman" w:hAnsi="Times New Roman" w:cs="Times New Roman"/>
+          <w:bCs/>
+          <w:lang w:val="en-CA"/>
+        </w:rPr>
+      </w:pPr>
+      <w:r>
+        <w:rPr>
+          <w:rFonts w:ascii="Times New Roman" w:hAnsi="Times New Roman" w:cs="Times New Roman"/>
+          <w:b/>
+          <w:lang w:val="en-CA"/>
+        </w:rPr>
+        <w:t>Galang, C.M.</w:t>
+      </w:r>
+      <w:r>
+        <w:rPr>
+          <w:rFonts w:ascii="Times New Roman" w:hAnsi="Times New Roman" w:cs="Times New Roman"/>
+          <w:bCs/>
+          <w:lang w:val="en-CA"/>
+        </w:rPr>
+        <w:t>, Biswas, M., Luk, M., &amp; Brass, M. (</w:t>
+      </w:r>
+      <w:r>
+        <w:rPr>
+          <w:rFonts w:ascii="Times New Roman" w:hAnsi="Times New Roman" w:cs="Times New Roman"/>
+          <w:bCs/>
+          <w:lang w:val="en-CA"/>
+        </w:rPr>
+        <w:t>Under Review</w:t>
+      </w:r>
+      <w:r>
+        <w:rPr>
+          <w:rFonts w:ascii="Times New Roman" w:hAnsi="Times New Roman" w:cs="Times New Roman"/>
+          <w:bCs/>
+          <w:lang w:val="en-CA"/>
+        </w:rPr>
+        <w:t>). Social Exclusion Does Not Affect Interval Estimation of Action-Outcome Events.</w:t>
+      </w:r>
+      <w:r>
+        <w:rPr>
+          <w:rFonts w:ascii="Times New Roman" w:hAnsi="Times New Roman" w:cs="Times New Roman"/>
+          <w:bCs/>
+          <w:lang w:val="en-CA"/>
+        </w:rPr>
+        <w:t xml:space="preserve"> </w:t>
+      </w:r>
+      <w:r>
+        <w:rPr>
+          <w:rFonts w:ascii="Times New Roman" w:hAnsi="Times New Roman" w:cs="Times New Roman"/>
+          <w:bCs/>
+          <w:i/>
+          <w:iCs/>
+          <w:lang w:val="en-CA"/>
+        </w:rPr>
+        <w:t>Consciousness and Cognition</w:t>
+      </w:r>
+      <w:r>
+        <w:rPr>
+          <w:rFonts w:ascii="Times New Roman" w:hAnsi="Times New Roman" w:cs="Times New Roman"/>
+          <w:bCs/>
+          <w:lang w:val="en-CA"/>
+        </w:rPr>
+        <w:t>.</w:t>
+      </w:r>
+    </w:p>
+    <w:p>
+      <w:pPr>
+        <w:spacing w:after="0" w:line="240" w:lineRule="auto"/>
+        <w:jc w:val="both"/>
+        <w:outlineLvl w:val="0"/>
+        <w:rPr>
+          <w:rFonts w:ascii="Times New Roman" w:hAnsi="Times New Roman" w:cs="Times New Roman"/>
+          <w:bCs/>
+          <w:lang w:val="en-CA"/>
+        </w:rPr>
+      </w:pPr>
+    </w:p>
+    <w:p>
+      <w:pPr>
+        <w:spacing w:after="0" w:line="240" w:lineRule="auto"/>
+        <w:jc w:val="both"/>
+        <w:outlineLvl w:val="0"/>
+        <w:rPr>
+          <w:rFonts w:ascii="Times New Roman" w:hAnsi="Times New Roman" w:cs="Times New Roman"/>
+          <w:bCs/>
+          <w:i/>
+          <w:iCs/>
+          <w:lang w:val="en-CA"/>
+        </w:rPr>
+      </w:pPr>
+      <w:r>
+        <w:rPr>
+          <w:rFonts w:ascii="Times New Roman" w:hAnsi="Times New Roman" w:cs="Times New Roman"/>
+          <w:bCs/>
+        </w:rPr>
+        <w:t xml:space="preserve">Dominik, T., Shum, Y. H., </w:t>
+      </w:r>
+      <w:r>
+        <w:rPr>
+          <w:rFonts w:ascii="Times New Roman" w:hAnsi="Times New Roman" w:cs="Times New Roman"/>
+          <w:b/>
+        </w:rPr>
+        <w:t>Galang, C. M.</w:t>
+      </w:r>
+      <w:r>
+        <w:rPr>
+          <w:rFonts w:ascii="Times New Roman" w:hAnsi="Times New Roman" w:cs="Times New Roman"/>
+          <w:bCs/>
+        </w:rPr>
+        <w:t>, &amp; Brass, M. (</w:t>
+      </w:r>
+      <w:r>
+        <w:rPr>
+          <w:rFonts w:ascii="Times New Roman" w:hAnsi="Times New Roman" w:cs="Times New Roman"/>
+          <w:bCs/>
+        </w:rPr>
+        <w:t>Under Review</w:t>
+      </w:r>
+      <w:r>
+        <w:rPr>
+          <w:rFonts w:ascii="Times New Roman" w:hAnsi="Times New Roman" w:cs="Times New Roman"/>
+          <w:bCs/>
+        </w:rPr>
+        <w:t xml:space="preserve">). When the clock lies: Intention reports can be biased by authoritative suggestion. </w:t>
+      </w:r>
+      <w:r>
+        <w:rPr>
+          <w:rFonts w:ascii="Times New Roman" w:hAnsi="Times New Roman" w:cs="Times New Roman"/>
+          <w:bCs/>
+          <w:i/>
+          <w:iCs/>
+        </w:rPr>
+        <w:t>Journal of Experimental Psychology: Human Perception and Performance</w:t>
+      </w:r>
+      <w:r>
+        <w:rPr>
+          <w:rFonts w:ascii="Times New Roman" w:hAnsi="Times New Roman" w:cs="Times New Roman"/>
+          <w:bCs/>
+        </w:rPr>
+        <w:t>.</w:t>
+      </w:r>
+    </w:p>
+    <w:p>
+      <w:pPr>
+        <w:spacing w:after="0" w:line="240" w:lineRule="auto"/>
+        <w:outlineLvl w:val="0"/>
+        <w:rPr>
+          <w:rFonts w:ascii="Times New Roman" w:hAnsi="Times New Roman" w:cs="Times New Roman"/>
+          <w:b/>
           <w:lang w:val="en-CA"/>
         </w:rPr>
       </w:pPr>
@@ -2632,15 +3127,6 @@
         <w:outlineLvl w:val="0"/>
         <w:rPr>
           <w:rFonts w:ascii="Times New Roman" w:hAnsi="Times New Roman" w:cs="Times New Roman"/>
-        </w:rPr>
-      </w:pPr>
-    </w:p>
-    <w:p>
-      <w:pPr>
-        <w:spacing w:after="0" w:line="240" w:lineRule="auto"/>
-        <w:outlineLvl w:val="0"/>
-        <w:rPr>
-          <w:rFonts w:ascii="Times New Roman" w:hAnsi="Times New Roman" w:cs="Times New Roman"/>
           <w:b/>
           <w:bCs/>
         </w:rPr>
@@ -2662,6 +3148,149 @@
           <w:rFonts w:ascii="Times New Roman" w:hAnsi="Times New Roman" w:cs="Times New Roman"/>
           <w:b/>
           <w:bCs/>
+        </w:rPr>
+      </w:pPr>
+    </w:p>
+    <w:p>
+      <w:pPr>
+        <w:spacing w:after="0" w:line="240" w:lineRule="auto"/>
+        <w:jc w:val="both"/>
+        <w:outlineLvl w:val="0"/>
+        <w:rPr>
+          <w:rFonts w:ascii="Times New Roman" w:hAnsi="Times New Roman" w:cs="Times New Roman"/>
+          <w:bCs/>
+        </w:rPr>
+      </w:pPr>
+      <w:r>
+        <w:rPr>
+          <w:rFonts w:ascii="Times New Roman" w:hAnsi="Times New Roman" w:cs="Times New Roman"/>
+          <w:b/>
+        </w:rPr>
+        <w:t>Galang, C.M.</w:t>
+      </w:r>
+      <w:r>
+        <w:rPr>
+          <w:rFonts w:ascii="Times New Roman" w:hAnsi="Times New Roman" w:cs="Times New Roman"/>
+          <w:bCs/>
+        </w:rPr>
+        <w:t>, Hassanein, K., Head, M., &amp; Obhi, S</w:t>
+      </w:r>
+      <w:r>
+        <w:rPr>
+          <w:rFonts w:ascii="Times New Roman" w:hAnsi="Times New Roman" w:cs="Times New Roman"/>
+          <w:bCs/>
+        </w:rPr>
+        <w:t>.</w:t>
+      </w:r>
+      <w:r>
+        <w:rPr>
+          <w:rFonts w:ascii="Times New Roman" w:hAnsi="Times New Roman" w:cs="Times New Roman"/>
+          <w:bCs/>
+        </w:rPr>
+        <w:t>S. (In Prep.).</w:t>
+      </w:r>
+      <w:r>
+        <w:rPr>
+          <w:rFonts w:ascii="Times New Roman" w:hAnsi="Times New Roman" w:cs="Times New Roman"/>
+          <w:b/>
+        </w:rPr>
+        <w:t xml:space="preserve"> </w:t>
+      </w:r>
+      <w:r>
+        <w:rPr>
+          <w:rFonts w:ascii="Times New Roman" w:hAnsi="Times New Roman" w:cs="Times New Roman"/>
+          <w:bCs/>
+        </w:rPr>
+        <w:t>The face of ChatGPT: Using reverse correlation to reveal internal representations of AI.</w:t>
+      </w:r>
+    </w:p>
+    <w:p>
+      <w:pPr>
+        <w:spacing w:after="0" w:line="240" w:lineRule="auto"/>
+        <w:jc w:val="both"/>
+        <w:outlineLvl w:val="0"/>
+        <w:rPr>
+          <w:rFonts w:ascii="Times New Roman" w:hAnsi="Times New Roman" w:cs="Times New Roman"/>
+          <w:b/>
+        </w:rPr>
+      </w:pPr>
+    </w:p>
+    <w:p>
+      <w:pPr>
+        <w:spacing w:after="0" w:line="240" w:lineRule="auto"/>
+        <w:jc w:val="both"/>
+        <w:outlineLvl w:val="0"/>
+        <w:rPr>
+          <w:rFonts w:ascii="Times New Roman" w:hAnsi="Times New Roman" w:cs="Times New Roman"/>
+          <w:bCs/>
+        </w:rPr>
+      </w:pPr>
+      <w:r>
+        <w:rPr>
+          <w:rFonts w:ascii="Times New Roman" w:hAnsi="Times New Roman" w:cs="Times New Roman"/>
+          <w:b/>
+        </w:rPr>
+        <w:t>Galang, C.M.</w:t>
+      </w:r>
+      <w:r>
+        <w:rPr>
+          <w:rFonts w:ascii="Times New Roman" w:hAnsi="Times New Roman" w:cs="Times New Roman"/>
+          <w:bCs/>
+        </w:rPr>
+        <w:t>, Hassanein, K., Head, M.</w:t>
+      </w:r>
+      <w:r>
+        <w:rPr>
+          <w:rFonts w:ascii="Times New Roman" w:hAnsi="Times New Roman" w:cs="Times New Roman"/>
+          <w:bCs/>
+        </w:rPr>
+        <w:t xml:space="preserve">, &amp; Mekik, </w:t>
+      </w:r>
+      <w:r>
+        <w:rPr>
+          <w:rFonts w:ascii="Times New Roman" w:hAnsi="Times New Roman" w:cs="Times New Roman"/>
+          <w:bCs/>
+        </w:rPr>
+        <w:t>S.</w:t>
+      </w:r>
+      <w:r>
+        <w:rPr>
+          <w:rFonts w:ascii="Times New Roman" w:hAnsi="Times New Roman" w:cs="Times New Roman"/>
+          <w:bCs/>
+        </w:rPr>
+        <w:t>C.</w:t>
+      </w:r>
+      <w:r>
+        <w:rPr>
+          <w:rFonts w:ascii="Times New Roman" w:hAnsi="Times New Roman" w:cs="Times New Roman"/>
+          <w:bCs/>
+        </w:rPr>
+        <w:t xml:space="preserve"> (</w:t>
+      </w:r>
+      <w:r>
+        <w:rPr>
+          <w:rFonts w:ascii="Times New Roman" w:hAnsi="Times New Roman" w:cs="Times New Roman"/>
+          <w:bCs/>
+        </w:rPr>
+        <w:t>In Prep</w:t>
+      </w:r>
+      <w:r>
+        <w:rPr>
+          <w:rFonts w:ascii="Times New Roman" w:hAnsi="Times New Roman" w:cs="Times New Roman"/>
+          <w:bCs/>
+        </w:rPr>
+        <w:t>.). Development and validation of the Epistemic Stance Test for generative AI (EST-GenAI).</w:t>
+      </w:r>
+    </w:p>
+    <w:p>
+      <w:pPr>
+        <w:spacing w:after="0" w:line="240" w:lineRule="auto"/>
+        <w:jc w:val="both"/>
+        <w:outlineLvl w:val="0"/>
+        <w:rPr>
+          <w:rFonts w:ascii="Times New Roman" w:hAnsi="Times New Roman" w:cs="Times New Roman"/>
+          <w:b/>
+          <w:lang w:val="en-CA"/>
         </w:rPr>
       </w:pPr>
     </w:p>
@@ -2737,7 +3366,16 @@
       <w:r>
         <w:rPr>
           <w:rFonts w:ascii="Times New Roman" w:hAnsi="Times New Roman" w:cs="Times New Roman"/>
-          <w:b/>
+          <w:bCs/>
+          <w:lang w:val="en-CA"/>
+        </w:rPr>
+        <w:t xml:space="preserve">Shum, Y.H., </w:t>
+      </w:r>
+      <w:r>
+        <w:rPr>
+          <w:rFonts w:ascii="Times New Roman" w:hAnsi="Times New Roman" w:cs="Times New Roman"/>
+          <w:b/>
+          <w:bCs/>
           <w:lang w:val="en-CA"/>
         </w:rPr>
         <w:t>Galang, C.M.</w:t>
@@ -2748,53 +3386,69 @@
           <w:bCs/>
           <w:lang w:val="en-CA"/>
         </w:rPr>
-        <w:t xml:space="preserve">, Biswas, M., Luk, M., &amp; Brass, M. (In Prep.). </w:t>
-      </w:r>
-      <w:r>
-        <w:rPr>
-          <w:rFonts w:ascii="Times New Roman" w:hAnsi="Times New Roman" w:cs="Times New Roman"/>
-          <w:bCs/>
-          <w:lang w:val="en-CA"/>
-        </w:rPr>
-        <w:t>Social Exclusion Does Not Affect Interval Estimation of Action-Outcome Events.</w:t>
-      </w:r>
-    </w:p>
-    <w:p>
-      <w:pPr>
-        <w:spacing w:after="0" w:line="240" w:lineRule="auto"/>
-        <w:jc w:val="both"/>
-        <w:outlineLvl w:val="0"/>
-        <w:rPr>
-          <w:rFonts w:ascii="Times New Roman" w:hAnsi="Times New Roman" w:cs="Times New Roman"/>
-          <w:bCs/>
-          <w:lang w:val="en-CA"/>
-        </w:rPr>
-      </w:pPr>
-    </w:p>
-    <w:p>
-      <w:pPr>
-        <w:spacing w:after="0" w:line="240" w:lineRule="auto"/>
-        <w:jc w:val="both"/>
-        <w:outlineLvl w:val="0"/>
-        <w:rPr>
-          <w:rFonts w:ascii="Times New Roman" w:hAnsi="Times New Roman" w:cs="Times New Roman"/>
-          <w:bCs/>
-          <w:lang w:val="en-CA"/>
-        </w:rPr>
-      </w:pPr>
-      <w:r>
-        <w:rPr>
-          <w:rFonts w:ascii="Times New Roman" w:hAnsi="Times New Roman" w:cs="Times New Roman"/>
-          <w:bCs/>
-          <w:lang w:val="en-CA"/>
-        </w:rPr>
-        <w:t xml:space="preserve">Shum, Y.H., </w:t>
-      </w:r>
-      <w:r>
-        <w:rPr>
-          <w:rFonts w:ascii="Times New Roman" w:hAnsi="Times New Roman" w:cs="Times New Roman"/>
-          <w:b/>
-          <w:bCs/>
+        <w:t>, &amp; Brass, M. (In Prep.). Stimulating Your Voluntariness: What Can Brain Stimulation Studies Tell Us about Intention and Voluntary Behaviors?</w:t>
+      </w:r>
+    </w:p>
+    <w:p>
+      <w:pPr>
+        <w:spacing w:after="0" w:line="240" w:lineRule="auto"/>
+        <w:jc w:val="both"/>
+        <w:outlineLvl w:val="0"/>
+        <w:rPr>
+          <w:rFonts w:ascii="Times New Roman" w:hAnsi="Times New Roman" w:cs="Times New Roman"/>
+          <w:bCs/>
+          <w:lang w:val="en-CA"/>
+        </w:rPr>
+      </w:pPr>
+    </w:p>
+    <w:p>
+      <w:pPr>
+        <w:spacing w:after="0" w:line="240" w:lineRule="auto"/>
+        <w:jc w:val="both"/>
+        <w:outlineLvl w:val="0"/>
+        <w:rPr>
+          <w:rFonts w:ascii="Times New Roman" w:hAnsi="Times New Roman" w:cs="Times New Roman"/>
+          <w:bCs/>
+          <w:lang w:val="en-CA"/>
+        </w:rPr>
+      </w:pPr>
+      <w:r>
+        <w:rPr>
+          <w:rFonts w:ascii="Times New Roman" w:hAnsi="Times New Roman" w:cs="Times New Roman"/>
+          <w:bCs/>
+          <w:lang w:val="en-CA"/>
+        </w:rPr>
+        <w:lastRenderedPageBreak/>
+        <w:t>Nisanci, S.</w:t>
+      </w:r>
+      <w:r>
+        <w:rPr>
+          <w:rFonts w:ascii="Times New Roman" w:hAnsi="Times New Roman" w:cs="Times New Roman"/>
+          <w:bCs/>
+          <w:lang w:val="en-CA"/>
+        </w:rPr>
+        <w:t xml:space="preserve">, </w:t>
+      </w:r>
+      <w:r>
+        <w:rPr>
+          <w:rFonts w:ascii="Times New Roman" w:hAnsi="Times New Roman" w:cs="Times New Roman"/>
+          <w:bCs/>
+          <w:lang w:val="en-CA"/>
+        </w:rPr>
+        <w:t>Formica, S., Brass, M.</w:t>
+      </w:r>
+      <w:r>
+        <w:rPr>
+          <w:rFonts w:ascii="Times New Roman" w:hAnsi="Times New Roman" w:cs="Times New Roman"/>
+          <w:bCs/>
+          <w:lang w:val="en-CA"/>
+        </w:rPr>
+        <w:t xml:space="preserve">, &amp; </w:t>
+      </w:r>
+      <w:r>
+        <w:rPr>
+          <w:rFonts w:ascii="Times New Roman" w:hAnsi="Times New Roman" w:cs="Times New Roman"/>
+          <w:b/>
           <w:lang w:val="en-CA"/>
         </w:rPr>
         <w:t>Galang, C.M.</w:t>
@@ -2805,78 +3459,6 @@
           <w:bCs/>
           <w:lang w:val="en-CA"/>
         </w:rPr>
-        <w:t>, &amp; Brass, M. (In Prep.). Stimulating Your Voluntariness: What Can Brain Stimulation Studies Tell Us about Intention and Voluntary Behaviors?</w:t>
-      </w:r>
-    </w:p>
-    <w:p>
-      <w:pPr>
-        <w:spacing w:after="0" w:line="240" w:lineRule="auto"/>
-        <w:jc w:val="both"/>
-        <w:outlineLvl w:val="0"/>
-        <w:rPr>
-          <w:rFonts w:ascii="Times New Roman" w:hAnsi="Times New Roman" w:cs="Times New Roman"/>
-          <w:bCs/>
-          <w:lang w:val="en-CA"/>
-        </w:rPr>
-      </w:pPr>
-    </w:p>
-    <w:p>
-      <w:pPr>
-        <w:spacing w:after="0" w:line="240" w:lineRule="auto"/>
-        <w:jc w:val="both"/>
-        <w:outlineLvl w:val="0"/>
-        <w:rPr>
-          <w:rFonts w:ascii="Times New Roman" w:hAnsi="Times New Roman" w:cs="Times New Roman"/>
-          <w:bCs/>
-          <w:lang w:val="en-CA"/>
-        </w:rPr>
-      </w:pPr>
-      <w:r>
-        <w:rPr>
-          <w:rFonts w:ascii="Times New Roman" w:hAnsi="Times New Roman" w:cs="Times New Roman"/>
-          <w:bCs/>
-          <w:lang w:val="en-CA"/>
-        </w:rPr>
-        <w:t>Nisanci, S.</w:t>
-      </w:r>
-      <w:r>
-        <w:rPr>
-          <w:rFonts w:ascii="Times New Roman" w:hAnsi="Times New Roman" w:cs="Times New Roman"/>
-          <w:bCs/>
-          <w:lang w:val="en-CA"/>
-        </w:rPr>
-        <w:t xml:space="preserve">, </w:t>
-      </w:r>
-      <w:r>
-        <w:rPr>
-          <w:rFonts w:ascii="Times New Roman" w:hAnsi="Times New Roman" w:cs="Times New Roman"/>
-          <w:bCs/>
-          <w:lang w:val="en-CA"/>
-        </w:rPr>
-        <w:t>Formica, S., Brass, M.</w:t>
-      </w:r>
-      <w:r>
-        <w:rPr>
-          <w:rFonts w:ascii="Times New Roman" w:hAnsi="Times New Roman" w:cs="Times New Roman"/>
-          <w:bCs/>
-          <w:lang w:val="en-CA"/>
-        </w:rPr>
-        <w:t xml:space="preserve">, &amp; </w:t>
-      </w:r>
-      <w:r>
-        <w:rPr>
-          <w:rFonts w:ascii="Times New Roman" w:hAnsi="Times New Roman" w:cs="Times New Roman"/>
-          <w:b/>
-          <w:lang w:val="en-CA"/>
-        </w:rPr>
-        <w:t>Galang, C.M.</w:t>
-      </w:r>
-      <w:r>
-        <w:rPr>
-          <w:rFonts w:ascii="Times New Roman" w:hAnsi="Times New Roman" w:cs="Times New Roman"/>
-          <w:bCs/>
-          <w:lang w:val="en-CA"/>
-        </w:rPr>
         <w:t xml:space="preserve"> (In Prep.). </w:t>
       </w:r>
       <w:r>
@@ -2965,64 +3547,6 @@
           <w:rFonts w:ascii="Times New Roman" w:hAnsi="Times New Roman" w:cs="Times New Roman"/>
           <w:bCs/>
           <w:lang w:val="en-CA"/>
-        </w:rPr>
-      </w:pPr>
-      <w:r>
-        <w:rPr>
-          <w:rFonts w:ascii="Times New Roman" w:hAnsi="Times New Roman" w:cs="Times New Roman"/>
-          <w:bCs/>
-          <w:lang w:val="en-CA"/>
-        </w:rPr>
-        <w:t xml:space="preserve">Marschner, M., </w:t>
-      </w:r>
-      <w:r>
-        <w:rPr>
-          <w:rFonts w:ascii="Times New Roman" w:hAnsi="Times New Roman" w:cs="Times New Roman"/>
-          <w:b/>
-          <w:lang w:val="en-CA"/>
-        </w:rPr>
-        <w:t xml:space="preserve">Galang, C.M., </w:t>
-      </w:r>
-      <w:r>
-        <w:rPr>
-          <w:rFonts w:ascii="Times New Roman" w:hAnsi="Times New Roman" w:cs="Times New Roman"/>
-          <w:bCs/>
-          <w:lang w:val="en-CA"/>
-        </w:rPr>
-        <w:t xml:space="preserve">Knoblich, G., &amp; Brass, M. (In Prep.). </w:t>
-      </w:r>
-      <w:r>
-        <w:rPr>
-          <w:rFonts w:ascii="Times New Roman" w:hAnsi="Times New Roman" w:cs="Times New Roman"/>
-          <w:bCs/>
-        </w:rPr>
-        <w:t>Us and Them: Anticipated Imitation Between Groups.</w:t>
-      </w:r>
-    </w:p>
-    <w:p>
-      <w:pPr>
-        <w:spacing w:after="0" w:line="240" w:lineRule="auto"/>
-        <w:jc w:val="both"/>
-        <w:outlineLvl w:val="0"/>
-        <w:rPr>
-          <w:rFonts w:ascii="Times New Roman" w:hAnsi="Times New Roman" w:cs="Times New Roman"/>
-          <w:b/>
-          <w:bCs/>
-        </w:rPr>
-      </w:pPr>
-    </w:p>
-    <w:p>
-      <w:pPr>
-        <w:pBdr>
-          <w:bottom w:val="single" w:sz="6" w:space="1" w:color="auto"/>
-        </w:pBdr>
-        <w:spacing w:after="0" w:line="240" w:lineRule="auto"/>
-        <w:jc w:val="both"/>
-        <w:outlineLvl w:val="0"/>
-        <w:rPr>
-          <w:rFonts w:ascii="Times New Roman" w:hAnsi="Times New Roman" w:cs="Times New Roman"/>
-          <w:b/>
-          <w:bCs/>
         </w:rPr>
       </w:pPr>
       <w:r>
@@ -3259,7 +3783,6 @@
         <w:rPr>
           <w:rFonts w:ascii="Times New Roman" w:hAnsi="Times New Roman" w:cs="Times New Roman"/>
         </w:rPr>
-        <w:lastRenderedPageBreak/>
         <w:t xml:space="preserve">Value: </w:t>
       </w:r>
       <w:r>
@@ -3599,6 +4122,47 @@
           <w:bCs/>
         </w:rPr>
         <w:t>Invited Talks</w:t>
+      </w:r>
+    </w:p>
+    <w:p>
+      <w:pPr>
+        <w:spacing w:after="0" w:line="240" w:lineRule="auto"/>
+        <w:jc w:val="both"/>
+        <w:outlineLvl w:val="0"/>
+        <w:rPr>
+          <w:rFonts w:ascii="Times New Roman" w:hAnsi="Times New Roman" w:cs="Times New Roman"/>
+        </w:rPr>
+      </w:pPr>
+      <w:r>
+        <w:rPr>
+          <w:rFonts w:ascii="Times New Roman" w:hAnsi="Times New Roman" w:cs="Times New Roman"/>
+          <w:b/>
+          <w:bCs/>
+        </w:rPr>
+        <w:t>June 3</w:t>
+      </w:r>
+      <w:r>
+        <w:rPr>
+          <w:rFonts w:ascii="Times New Roman" w:hAnsi="Times New Roman" w:cs="Times New Roman"/>
+          <w:b/>
+          <w:bCs/>
+          <w:vertAlign w:val="superscript"/>
+        </w:rPr>
+        <w:t>rd</w:t>
+      </w:r>
+      <w:r>
+        <w:rPr>
+          <w:rFonts w:ascii="Times New Roman" w:hAnsi="Times New Roman" w:cs="Times New Roman"/>
+          <w:b/>
+          <w:bCs/>
+        </w:rPr>
+        <w:t xml:space="preserve">, 2026 </w:t>
+      </w:r>
+      <w:r>
+        <w:rPr>
+          <w:rFonts w:ascii="Times New Roman" w:hAnsi="Times New Roman" w:cs="Times New Roman"/>
+        </w:rPr>
+        <w:t>– “Empathic Sensorimotor Resonance”, CSBBCS Symposium, York University, Canada</w:t>
       </w:r>
     </w:p>
     <w:p>

</xml_diff>